<commit_message>
fix: COP.2 Emergency Triage SOP - colour-zone triage as default, ESI as alternative
SOP previously cited only US-origin ESI for triage categorisation, not
matching common Indian hospital practice. Now defaults to RED/YELLOW/
GREEN/BLACK colour-zone triage (reflecting prevailing Indian practice;
NABH does not mandate a specific tool), with ESI kept as a documented
alternative for hospitals that have already adopted it instead - not
run alongside it. Reassessment-interval guidance covers both systems.

Co-Authored-By: Claude Sonnet 5 <noreply@anthropic.com>
Claude-Session: https://claude.ai/code/session_01TPRLtLhmTCP5z94Q3FiE5v
</commit_message>
<xml_diff>
--- a/policies/build/chapters_v2/COP/document/COP2/SOP_Emergency_Triage.docx
+++ b/policies/build/chapters_v2/COP/document/COP2/SOP_Emergency_Triage.docx
@@ -321,10 +321,7 @@
     </w:p>
     <w:p>
       <w:r>
-        <w:t xml:space="preserve">Triage Nurse/Doctor: </w:t>
-      </w:r>
-      <w:r>
-        <w:t>assigns and documents the triage category, and monitors patients for reassessment timing while waiting.</w:t>
+        <w:t xml:space="preserve">Triage Nurse/Doctor: assigns and documents the triage category, and monitors patients for reassessment timing while waiting.</w:t>
       </w:r>
     </w:p>
     <w:p>
@@ -348,10 +345,24 @@
         <w:rPr>
           <w:b/>
         </w:rPr>
+        <w:t xml:space="preserve">Colour-zone triage: </w:t>
+      </w:r>
+      <w:r>
+        <w:t>a four-category system (RED / YELLOW / GREEN / BLACK) used to sort emergency patients by how urgently they need care; the default system under this SOP.</w:t>
+      </w:r>
+    </w:p>
+    <w:p>
+      <w:pPr>
+        <w:pStyle w:val="ListParagraph"/>
+      </w:pPr>
+      <w:r>
+        <w:rPr>
+          <w:b/>
+        </w:rPr>
         <w:t xml:space="preserve">ESI: </w:t>
       </w:r>
       <w:r>
-        <w:t>Emergency Severity Index — a five-level scale used to sort emergency patients by how urgently they need care.</w:t>
+        <w:t>Emergency Severity Index — a five-level scale used to sort emergency patients by how urgently they need care; an accepted alternative to colour-zone triage for hospitals that have already adopted it.</w:t>
       </w:r>
     </w:p>
     <w:p>
@@ -379,42 +390,42 @@
     </w:p>
     <w:p>
       <w:r>
-        <w:t>1. Assign a triage category to every patient on arrival, using the hospital's adopted triage tool (e.g. a five-level system such as the Emergency Severity Index).</w:t>
+        <w:t>1. Assign a triage category to every patient on arrival, using the hospital’s adopted triage system. The default system under this SOP is the four-zone colour-coded system (RED / YELLOW / GREEN / BLACK), which reflects common practice in Indian hospitals. NABH does not mandate one specific triage tool — it requires that the hospital define and consistently apply a single system; a five-level system such as ESI (step 7) is an equally acceptable alternative where already adopted.</w:t>
       </w:r>
     </w:p>
     <w:p>
       <w:r>
-        <w:t>2. A five-level tool such as ESI typically categorises patients as follows:</w:t>
+        <w:t>2. The colour-zone system categorises patients as follows:</w:t>
       </w:r>
     </w:p>
     <w:p>
       <w:r>
-        <w:t>3.      •  Level 1 — immediate life threat (e.g. cardiac arrest, not breathing)</w:t>
+        <w:t>3.      •  RED — immediate life threat, needs resuscitation now (e.g. cardiac arrest, not breathing, uncontrolled major bleeding)</w:t>
       </w:r>
     </w:p>
     <w:p>
       <w:r>
-        <w:t>4.      •  Level 2 — high risk, could deteriorate fast (e.g. severe chest pain, active major bleeding, altered consciousness)</w:t>
+        <w:t>4.      •  YELLOW — urgent, could deteriorate, needs care soon (e.g. severe chest pain, controlled major bleeding, altered consciousness)</w:t>
       </w:r>
     </w:p>
     <w:p>
       <w:r>
-        <w:t>5.      •  Level 3 — urgent, stable but needs several resources (e.g. abdominal pain needing labs and imaging)</w:t>
+        <w:t>5.      •  GREEN — stable, can safely wait (e.g. minor injuries, stable complaints not needing immediate intervention)</w:t>
       </w:r>
     </w:p>
     <w:p>
       <w:r>
-        <w:t>6.      •  Level 4 — less urgent, needs one resource (e.g. a simple laceration needing sutures)</w:t>
+        <w:t>6.      •  BLACK — deceased or beyond resuscitation on arrival</w:t>
       </w:r>
     </w:p>
     <w:p>
       <w:r>
-        <w:t>7.      •  Level 5 — non-urgent, needs no resources (e.g. a prescription refill query)</w:t>
+        <w:t>7. Alternative (ESI) — for a hospital that has already adopted the five-level Emergency Severity Index in place of the colour-zone system, not in addition to it: Level 1 — immediate life threat; Level 2 — high risk, could deteriorate fast; Level 3 — urgent, stable but needs several resources; Level 4 — less urgent, needs one resource; Level 5 — non-urgent, needs no resources.</w:t>
       </w:r>
     </w:p>
     <w:p>
       <w:r>
-        <w:t>8. [Hospital to define: state here which specific tool and category set this hospital has adopted, if different from this example.]</w:t>
+        <w:t>8. [Hospital to define: state here which ONE system — colour-zone or ESI — this hospital has adopted as its single triage system, and the exact criteria/category set if different from the examples above. The two systems are not run together.]</w:t>
       </w:r>
     </w:p>
     <w:p>
@@ -434,7 +445,7 @@
     </w:p>
     <w:p>
       <w:r>
-        <w:t>12. [Hospital to define: state the actual reassessment interval for each triage level — a working starting point, consistent with common ED practice, is: Level 1/2 — continuous or every 10-15 minutes; Level 3 — every 30-60 minutes; Level 4/5 — every 1-2 hours or on patient/family request.]</w:t>
+        <w:t>12. [Hospital to define: state the actual reassessment interval for each triage category — a working starting point, consistent with common ED practice, is: RED — continuous monitoring; YELLOW — every 15-30 minutes; GREEN — every 1-2 hours or on patient/family request. (For a hospital using ESI instead: Level 1/2 — continuous or every 10-15 minutes; Level 3 — every 30-60 minutes; Level 4/5 — every 1-2 hours or on patient/family request.)]</w:t>
       </w:r>
     </w:p>
     <w:p>
@@ -535,6 +546,14 @@
           <w:t>AHRQ — Emergency Severity Index (ESI): A Triage Tool for Emergency Departments</w:t>
         </w:r>
       </w:hyperlink>
+    </w:p>
+    <w:p>
+      <w:pPr>
+        <w:pStyle w:val="ListParagraph"/>
+      </w:pPr>
+      <w:r>
+        <w:t>Directorate General of Health Services, Ministry of Health &amp; Family Welfare, Government of India — Hospital Manual, April 2025, Chapter 1 (Emergency Services), para 1.14 — referenced as one example documenting colour-zone triage as common Indian hospital practice, not as a binding NABH requirement.</w:t>
+      </w:r>
     </w:p>
     <w:p>
       <w:pPr>

</xml_diff>